<commit_message>
Update Ariana's judgment and learning reflection with confirmed reasoning
</commit_message>
<xml_diff>
--- a/MASY1800_ET_Agent_Scaffold_v1_0/agents/promethean_agent/records/Delivery_Robots_Professional_Judgment.docx
+++ b/MASY1800_ET_Agent_Scaffold_v1_0/agents/promethean_agent/records/Delivery_Robots_Professional_Judgment.docx
@@ -25,7 +25,7 @@
     </w:p>
     <w:p>
       <w:r>
-        <w:t>I would classify indoor autonomous delivery robots as a bounded Breakthrough, with moderate confidence, rather than Potential Promethean. Compared with carrying a tray or pushing a cart, the system can complete a route without a person accompanying every trip. That is a meaningful capability change. However, goods still travel through physical space, and people still handle loading, handoff and exceptions. If these robots disappeared, restaurants and hotels could return to staff delivery. The sources do not show irreversible change across multiple tiers of life.</w:t>
+        <w:t>I initially thought indoor autonomous delivery robots might be Potential Promethean because they can deliver items without someone accompanying every trip. When I discussed this with ChatGPT, the point that restaurants could return to manual delivery changed my view: the robots reduce the need for people to accompany deliveries, but do not dissolve the underlying barrier. I now classify them as Breakthrough, with moderate confidence. People still load items, receive deliveries, and handle problems, and the current evidence does not establish fundamental change across multiple tiers of human life.</w:t>
       </w:r>
     </w:p>
     <w:p>
@@ -48,7 +48,7 @@
     </w:p>
     <w:p>
       <w:r>
-        <w:t>The initial output said to compare efficiency and staff workload, but it did not explain what to count. That could make a robot look useful just because servers walk less, while extra loading, supervision and rescue work go unnoticed. Checking the operating manual made those remaining tasks clearer. I revised the agent to measure total human time and define when a trial should stop or expand. Next time, I would judge the whole service process before treating an automated task as a business improvement.</w:t>
+        <w:t>I initially thought delivery robots might be Potential Promethean because they can deliver items independently. During my discussion with ChatGPT, the point that restaurants could return to manual delivery helped me understand the difference between reducing a barrier and dissolving it. The robots reduce the need for staff to accompany every trip, but loading, receiving items, and handling problems still require people. Next time, I would ask what limitations remain before deciding how transformative a technology is.</w:t>
       </w:r>
     </w:p>
     <w:p>

</xml_diff>